<commit_message>
Integrate supplied source papers into revised manuscript
Corrected the helical mesh-deflection interpretation (calculated pair-specific
value, Hotait 2008), the planetary mesh-only deflection convention (meshes in
parallel at the planet centre, Ligata 2009; eta 0.12, factor 8.6), added the
closed-form single-error relation as Eq. (8), reinterpreted the industrial
transfer with the system-level results of Kim 2018b, and added qualitative
third-laboratory evidence from Dong 2019 and planet-tilting findings of Hu 2018.

Co-Authored-By: Claude Opus 5.5 <noreply@anthropic.com>
Claude-Session: https://claude.ai/code/session_012H2iBimd6WnZpPhhsFnRvZ
</commit_message>
<xml_diff>
--- a/Misalignment_Load_Redistribution_IJPEM_revised.docx
+++ b/Misalignment_Load_Redistribution_IJPEM_revised.docx
@@ -76,7 +76,7 @@
         <w:jc w:val="both"/>
       </w:pPr>
       <w:r>
-        <w:t xml:space="preserve">Shaft misalignment and carrier pinhole position errors redistribute load across the face width of a gear mesh and among the planets of a planetary gear set, yet rating standards describe the two cases with separate factors. This study examined whether both depend on misalignment through one dimensionless compliance ratio, the geometric mismatch divided by the effective elastic deflection of the loaded path. Measurements from six experimental studies (helical, hypoid, spur and planetary gears; three laboratories) were divided, before model fitting, into calibration, internal validation and external validation sets. For a helical pair, the normalised face-width redistribution slope was linear in the ratio with a coefficient of 0.90 (95% confidence interval 0.80–1.05; </w:t>
+        <w:t xml:space="preserve">Shaft misalignment and carrier pinhole position errors redistribute load across the face width of a gear mesh and among the planets of a planetary gear set, yet rating standards describe the two cases with separate factors. This study examined whether both depend on misalignment through one dimensionless compliance ratio, the geometric mismatch divided by the effective elastic deflection of the loaded path. Measurements from six experimental studies (helical, hypoid, spur and planetary gears; three laboratories) were split, before fitting, into calibration and validation sets. For a helical pair, the face-width redistribution slope was linear in the ratio with a coefficient of 0.90 (95% confidence interval 0.80–1.05; </w:t>
       </w:r>
       <w:r>
         <w:rPr>
@@ -92,7 +92,7 @@
         <w:t xml:space="preserve">2</w:t>
       </w:r>
       <w:r>
-        <w:t xml:space="preserve"> = 0.975), and ISO 6336-1 Method C matched or exceeded the measured root-strain ratios once an effective residual misalignment was included. For planetary sets with a floating sun, a one-parameter path model based on the same ratio reproduced measured six-planet load shares with a root-mean-square error of 1.6 percentage points, comparable to a multibody contact model (1.7 points). The effective path deflection was about 4.3 times the ISO 6336-1 mesh deflection and grew sub-linearly with load, so the mesh load factor decreased with torque with a pooled exponent of 0.73 (95% confidence interval 0.64–0.83). Without recalibration, the model reduced the per-pin error on an industrial six-planet gearbox by 24% in one of two data sets. No published transmission-error study reports both misalignment magnitude and mesh deflection, so a transmission-error relation could not be tested.</w:t>
+        <w:t xml:space="preserve"> = 0.975) when the pair-specific mesh deflection was used, and ISO 6336-1 Method C matched or exceeded the measured root-strain ratios once an effective residual misalignment was included. For planetary sets with a floating sun, a one-parameter path model based on the same ratio reproduced measured six-planet load shares with a root-mean-square error of 1.6 percentage points, as accurately as a multibody contact model. The effective planet-centre deflection was about 8.6 times the mesh-only value from ISO 6336-1 and grew sub-linearly with load, so the mesh load factor decreased with torque with a pooled exponent of 0.73 (95% confidence interval 0.64–0.83). Without recalibration, the model reduced the per-pin error on an industrial six-planet gearbox by 24% in one of two data sets. No published transmission-error study reports both misalignment magnitude and mesh deflection, so a transmission-error relation could not be tested.</w:t>
       </w:r>
     </w:p>
     <w:p>
@@ -314,7 +314,7 @@
         <w:jc w:val="both"/>
       </w:pPr>
       <w:r>
-        <w:t xml:space="preserve">Root-strain experiments have shown that controlled shaft misalignment shifts the load towards one end of a helical face width [4] and between toe and heel of a hypoid pair [5]; both quantified the misalignment, and the helical study also reported the mesh deflection. Unloaded contact-pattern measurements quantified the loss of contact area under axial, radial and angular misalignment [6]. Finite-element loaded tooth contact analysis showed that misalignment in the plane of action changes contact and root stresses, load sharing and transmission error, whereas misalignment normal to that plane has little effect [7, 8]. Misalignment also reduces the time-varying mesh stiffness [9] and changes the contact pattern and contact fatigue life of profile-shifted helical gears [10], and lead modification can move the load from the face ends towards the centre [11]. A recent finite-element assessment found that the ISO 6336 methods overestimate the face load factor of helical gears in most of the cases examined [12]. These models predict the distribution of a given gear pair but do not reduce it to a dimensionless parameter that is comparable across gear pairs, loads and architectures.</w:t>
+        <w:t xml:space="preserve">Root-strain experiments have shown that controlled shaft misalignment shifts the load towards one end of a helical face width [4] and between toe and heel of a hypoid pair [5]. Unloaded contact-pattern measurements quantified the loss of contact area under axial, radial and angular misalignment [6]. Finite-element loaded tooth contact analysis showed that misalignment in the plane of action changes contact and root stresses, load sharing and transmission error, whereas misalignment normal to that plane has little effect [7, 8]. Misalignment also reduces the time-varying mesh stiffness [9] and changes the contact pattern and contact fatigue life of profile-shifted helical gears [10], and lead modification can move the load from the face ends towards the centre [11]. A recent finite-element assessment found that the ISO 6336 methods overestimate the face load factor of helical gears in most of the cases examined [12]. These models predict the distribution of a given gear pair but do not reduce it to a dimensionless parameter that is comparable across gear pairs, loads and architectures.</w:t>
       </w:r>
     </w:p>
     <w:p>
@@ -333,7 +333,7 @@
         <w:jc w:val="both"/>
       </w:pPr>
       <w:r>
-        <w:t xml:space="preserve">Planet load sharing has been modelled with discrete [13–15], system-level and deformable-body [16, 17] and three-dimensional formulations that include manufacturing errors and tooth modifications [18–20]. The translational analogy of Ligata et al. [15] gives closed-form planet loads as functions of the planet position errors while all planets remain loaded; multi-mesh models solve the load distribution along all meshes simultaneously, including manufacturing and assembly errors [19]; and slice-based discrete models couple three-dimensional planet position errors with tooth modifications [20]. Parametric studies have analysed the influence of carrier pinhole position errors [21] and of the system configuration [22] on load sharing. Experimentally, ring-gear strain measurements showed that a single carrier pinhole error can almost unload a planet [17, 23], and measurements on an industrial gearbox quantified the effect of measured pinhole position errors under static and rotating conditions [24, 25]. No single governing ratio has been identified in these studies, and the torque dependence of </w:t>
+        <w:t xml:space="preserve">Planet load sharing has been modelled with discrete [13–15], system-level and deformable-body [16, 17] and three-dimensional formulations that include manufacturing errors and tooth modifications [18–20]. The translational analogy of [15] represents each planet by its sun and ring mesh springs in parallel, in series with the planet bearing, and gives closed-form planet loads while all planets remain loaded. Multi-mesh models show that planet tilting loads opposite face ends of the sun–planet and ring–planet meshes [19], and slice-based models with three-dimensional pinhole errors were validated on wind-turbine stages [20]. A system-level model of an industrial gearbox reproduced its measured load shares within 10% [21], and the system configuration has been studied parametrically [22]. Experimentally, a single carrier pinhole error can almost unload a planet [17, 23], and measurements on the same industrial gearbox quantified the effect of measured pinhole errors under static and rotating conditions [24, 25]. No single governing ratio has been identified, and the torque dependence of </w:t>
       </w:r>
       <w:r>
         <w:rPr>
@@ -389,7 +389,7 @@
         <w:jc w:val="both"/>
       </w:pPr>
       <w:r>
-        <w:t xml:space="preserve">Table 1 shows that misalignment magnitude and load distribution are reported in several studies, but mesh deflection only for one helical rig and transmission error only once, without a misalignment magnitude. Whether face-width and planet-to-planet redistribution collapse onto one deflection-normalised ratio has therefore not been tested on independent measurements, and the data for an equivalent test on transmission error do not yet exist. This study addresses the first gap and specifies the experiment needed for the second.</w:t>
+        <w:t xml:space="preserve">Table 1 shows that misalignment magnitude and load distribution are reported in several studies, but mesh deflection only for one helical pair (as a calculated value) and transmission error only once, without a misalignment magnitude. Whether face-width and planet-to-planet redistribution collapse onto one deflection-normalised ratio has therefore not been tested on independent measurements, and the data for an equivalent test on transmission error do not yet exist. This study addresses the first gap and specifies the experiment needed for the second.</w:t>
       </w:r>
     </w:p>
     <w:p>
@@ -977,7 +977,7 @@
                 <w:sz w:val="16"/>
                 <w:szCs w:val="16"/>
               </w:rPr>
-              <w:t xml:space="preserve">Y (17 µm at 200 N·m)</w:t>
+              <w:t xml:space="preserve">Y (calculated: 17 µm at 200 N·m)</w:t>
             </w:r>
           </w:p>
         </w:tc>
@@ -2010,6 +2010,237 @@
                 <w:szCs w:val="16"/>
               </w:rPr>
               <w:t xml:space="preserve">Y (25–125%)</w:t>
+            </w:r>
+          </w:p>
+        </w:tc>
+        <w:tc>
+          <w:tcPr>
+            <w:tcW w:w="520" w:type="dxa"/>
+            <w:tcBorders>
+              <w:top w:val="nil"/>
+              <w:left w:val="nil"/>
+              <w:bottom w:val="nil"/>
+              <w:right w:val="nil"/>
+            </w:tcBorders>
+            <w:tcMar>
+              <w:top w:w="30" w:type="dxa"/>
+              <w:left w:w="60" w:type="dxa"/>
+              <w:bottom w:w="30" w:type="dxa"/>
+              <w:right w:w="60" w:type="dxa"/>
+            </w:tcMar>
+          </w:tcPr>
+          <w:p>
+            <w:pPr>
+              <w:spacing w:before="0" w:after="0" w:line="240" w:lineRule="auto"/>
+              <w:jc w:val="left"/>
+            </w:pPr>
+            <w:r>
+              <w:rPr>
+                <w:sz w:val="16"/>
+                <w:szCs w:val="16"/>
+              </w:rPr>
+              <w:t xml:space="preserve">–</w:t>
+            </w:r>
+          </w:p>
+        </w:tc>
+      </w:tr>
+      <w:tr>
+        <w:trPr>
+          <w:cantSplit/>
+        </w:trPr>
+        <w:tc>
+          <w:tcPr>
+            <w:tcW w:w="1650" w:type="dxa"/>
+            <w:tcBorders>
+              <w:top w:val="nil"/>
+              <w:left w:val="nil"/>
+              <w:bottom w:val="nil"/>
+              <w:right w:val="nil"/>
+            </w:tcBorders>
+            <w:tcMar>
+              <w:top w:w="30" w:type="dxa"/>
+              <w:left w:w="60" w:type="dxa"/>
+              <w:bottom w:w="30" w:type="dxa"/>
+              <w:right w:w="60" w:type="dxa"/>
+            </w:tcMar>
+          </w:tcPr>
+          <w:p>
+            <w:pPr>
+              <w:spacing w:before="0" w:after="0" w:line="240" w:lineRule="auto"/>
+              <w:jc w:val="left"/>
+            </w:pPr>
+            <w:r>
+              <w:rPr>
+                <w:sz w:val="16"/>
+                <w:szCs w:val="16"/>
+              </w:rPr>
+              <w:t xml:space="preserve">Dong et al. [20]</w:t>
+            </w:r>
+          </w:p>
+        </w:tc>
+        <w:tc>
+          <w:tcPr>
+            <w:tcW w:w="1500" w:type="dxa"/>
+            <w:tcBorders>
+              <w:top w:val="nil"/>
+              <w:left w:val="nil"/>
+              <w:bottom w:val="nil"/>
+              <w:right w:val="nil"/>
+            </w:tcBorders>
+            <w:tcMar>
+              <w:top w:w="30" w:type="dxa"/>
+              <w:left w:w="60" w:type="dxa"/>
+              <w:bottom w:w="30" w:type="dxa"/>
+              <w:right w:w="60" w:type="dxa"/>
+            </w:tcMar>
+          </w:tcPr>
+          <w:p>
+            <w:pPr>
+              <w:spacing w:before="0" w:after="0" w:line="240" w:lineRule="auto"/>
+              <w:jc w:val="left"/>
+            </w:pPr>
+            <w:r>
+              <w:rPr>
+                <w:sz w:val="16"/>
+                <w:szCs w:val="16"/>
+              </w:rPr>
+              <w:t xml:space="preserve">Wind-turbine helical planetary, </w:t>
+            </w:r>
+            <w:r>
+              <w:rPr>
+                <w:i/>
+                <w:iCs/>
+                <w:sz w:val="16"/>
+                <w:szCs w:val="16"/>
+              </w:rPr>
+              <w:t xml:space="preserve">n</w:t>
+            </w:r>
+            <w:r>
+              <w:rPr>
+                <w:sz w:val="16"/>
+                <w:szCs w:val="16"/>
+              </w:rPr>
+              <w:t xml:space="preserve"> = 3, 4</w:t>
+            </w:r>
+          </w:p>
+        </w:tc>
+        <w:tc>
+          <w:tcPr>
+            <w:tcW w:w="1650" w:type="dxa"/>
+            <w:tcBorders>
+              <w:top w:val="nil"/>
+              <w:left w:val="nil"/>
+              <w:bottom w:val="nil"/>
+              <w:right w:val="nil"/>
+            </w:tcBorders>
+            <w:tcMar>
+              <w:top w:w="30" w:type="dxa"/>
+              <w:left w:w="60" w:type="dxa"/>
+              <w:bottom w:w="30" w:type="dxa"/>
+              <w:right w:w="60" w:type="dxa"/>
+            </w:tcMar>
+          </w:tcPr>
+          <w:p>
+            <w:pPr>
+              <w:spacing w:before="0" w:after="0" w:line="240" w:lineRule="auto"/>
+              <w:jc w:val="left"/>
+            </w:pPr>
+            <w:r>
+              <w:rPr>
+                <w:sz w:val="16"/>
+                <w:szCs w:val="16"/>
+              </w:rPr>
+              <w:t xml:space="preserve">Y (measured 3D pinhole errors)</w:t>
+            </w:r>
+          </w:p>
+        </w:tc>
+        <w:tc>
+          <w:tcPr>
+            <w:tcW w:w="1300" w:type="dxa"/>
+            <w:tcBorders>
+              <w:top w:val="nil"/>
+              <w:left w:val="nil"/>
+              <w:bottom w:val="nil"/>
+              <w:right w:val="nil"/>
+            </w:tcBorders>
+            <w:tcMar>
+              <w:top w:w="30" w:type="dxa"/>
+              <w:left w:w="60" w:type="dxa"/>
+              <w:bottom w:w="30" w:type="dxa"/>
+              <w:right w:w="60" w:type="dxa"/>
+            </w:tcMar>
+          </w:tcPr>
+          <w:p>
+            <w:pPr>
+              <w:spacing w:before="0" w:after="0" w:line="240" w:lineRule="auto"/>
+              <w:jc w:val="left"/>
+            </w:pPr>
+            <w:r>
+              <w:rPr>
+                <w:sz w:val="16"/>
+                <w:szCs w:val="16"/>
+              </w:rPr>
+              <w:t xml:space="preserve">–</w:t>
+            </w:r>
+          </w:p>
+        </w:tc>
+        <w:tc>
+          <w:tcPr>
+            <w:tcW w:w="1250" w:type="dxa"/>
+            <w:tcBorders>
+              <w:top w:val="nil"/>
+              <w:left w:val="nil"/>
+              <w:bottom w:val="nil"/>
+              <w:right w:val="nil"/>
+            </w:tcBorders>
+            <w:tcMar>
+              <w:top w:w="30" w:type="dxa"/>
+              <w:left w:w="60" w:type="dxa"/>
+              <w:bottom w:w="30" w:type="dxa"/>
+              <w:right w:w="60" w:type="dxa"/>
+            </w:tcMar>
+          </w:tcPr>
+          <w:p>
+            <w:pPr>
+              <w:spacing w:before="0" w:after="0" w:line="240" w:lineRule="auto"/>
+              <w:jc w:val="left"/>
+            </w:pPr>
+            <w:r>
+              <w:rPr>
+                <w:sz w:val="16"/>
+                <w:szCs w:val="16"/>
+              </w:rPr>
+              <w:t xml:space="preserve">Y (ring root strain across the face width)</w:t>
+            </w:r>
+          </w:p>
+        </w:tc>
+        <w:tc>
+          <w:tcPr>
+            <w:tcW w:w="1200" w:type="dxa"/>
+            <w:tcBorders>
+              <w:top w:val="nil"/>
+              <w:left w:val="nil"/>
+              <w:bottom w:val="nil"/>
+              <w:right w:val="nil"/>
+            </w:tcBorders>
+            <w:tcMar>
+              <w:top w:w="30" w:type="dxa"/>
+              <w:left w:w="60" w:type="dxa"/>
+              <w:bottom w:w="30" w:type="dxa"/>
+              <w:right w:w="60" w:type="dxa"/>
+            </w:tcMar>
+          </w:tcPr>
+          <w:p>
+            <w:pPr>
+              <w:spacing w:before="0" w:after="0" w:line="240" w:lineRule="auto"/>
+              <w:jc w:val="left"/>
+            </w:pPr>
+            <w:r>
+              <w:rPr>
+                <w:sz w:val="16"/>
+                <w:szCs w:val="16"/>
+              </w:rPr>
+              <w:t xml:space="preserve">Y (25–100%)</w:t>
             </w:r>
           </w:p>
         </w:tc>
@@ -5069,7 +5300,87 @@
         <w:t xml:space="preserve">t</w:t>
       </w:r>
       <w:r>
-        <w:t xml:space="preserve"> the total tangential load. Mesh forces act tangentially (the pressure-angle component of the sun translation is neglected), and the planets are equally spaced. This translational representation is of the type used in the closed-form formulation of [15]; here it was solved by minimising the elastic energy subject to the unilateral constraint, so that a planet may lose contact. With </w:t>
+        <w:t xml:space="preserve"> the total tangential load at the pin circle (</w:t>
+      </w:r>
+      <w:r>
+        <w:rPr>
+          <w:i/>
+          <w:iCs/>
+        </w:rPr>
+        <w:t xml:space="preserve">F</w:t>
+      </w:r>
+      <w:r>
+        <w:rPr>
+          <w:vertAlign w:val="subscript"/>
+        </w:rPr>
+        <w:t xml:space="preserve">t</w:t>
+      </w:r>
+      <w:r>
+        <w:t xml:space="preserve"> = 2</w:t>
+      </w:r>
+      <w:r>
+        <w:rPr>
+          <w:i/>
+          <w:iCs/>
+        </w:rPr>
+        <w:t xml:space="preserve">T</w:t>
+      </w:r>
+      <w:r>
+        <w:rPr>
+          <w:vertAlign w:val="subscript"/>
+        </w:rPr>
+        <w:t xml:space="preserve">s</w:t>
+      </w:r>
+      <w:r>
+        <w:t xml:space="preserve">/</w:t>
+      </w:r>
+      <w:r>
+        <w:rPr>
+          <w:i/>
+          <w:iCs/>
+        </w:rPr>
+        <w:t xml:space="preserve">r</w:t>
+      </w:r>
+      <w:r>
+        <w:rPr>
+          <w:vertAlign w:val="subscript"/>
+        </w:rPr>
+        <w:t xml:space="preserve">s</w:t>
+      </w:r>
+      <w:r>
+        <w:t xml:space="preserve"> for a fixed ring, with sun torque </w:t>
+      </w:r>
+      <w:r>
+        <w:rPr>
+          <w:i/>
+          <w:iCs/>
+        </w:rPr>
+        <w:t xml:space="preserve">T</w:t>
+      </w:r>
+      <w:r>
+        <w:rPr>
+          <w:vertAlign w:val="subscript"/>
+        </w:rPr>
+        <w:t xml:space="preserve">s</w:t>
+      </w:r>
+      <w:r>
+        <w:t xml:space="preserve"> and sun pitch radius </w:t>
+      </w:r>
+      <w:r>
+        <w:rPr>
+          <w:i/>
+          <w:iCs/>
+        </w:rPr>
+        <w:t xml:space="preserve">r</w:t>
+      </w:r>
+      <w:r>
+        <w:rPr>
+          <w:vertAlign w:val="subscript"/>
+        </w:rPr>
+        <w:t xml:space="preserve">s</w:t>
+      </w:r>
+      <w:r>
+        <w:t xml:space="preserve"> [15]). Mesh forces act tangentially (the pressure-angle component of the sun translation is neglected), and the planets are equally spaced. Equation (5) is the translational analogy of [15]; here it was solved by minimising the elastic energy subject to the unilateral constraint, so that a planet may lose contact. With </w:t>
       </w:r>
       <w:r>
         <w:rPr>
@@ -5117,7 +5428,7 @@
         <w:t xml:space="preserve">p</w:t>
       </w:r>
       <w:r>
-        <w:t xml:space="preserve">), the solution depends only on </w:t>
+        <w:t xml:space="preserve">), the mean tangential displacement of the planet centres, the solution depends only on </w:t>
       </w:r>
       <w:r>
         <w:rPr>
@@ -5544,7 +5855,7 @@
         <w:t xml:space="preserve">ISO</w:t>
       </w:r>
       <w:r>
-        <w:t xml:space="preserve"> the mean deflection at </w:t>
+        <w:t xml:space="preserve"> the planet-centre displacement at </w:t>
       </w:r>
       <w:r>
         <w:rPr>
@@ -5560,7 +5871,7 @@
         <w:t xml:space="preserve">ref</w:t>
       </w:r>
       <w:r>
-        <w:t xml:space="preserve"> of the sun–planet and planet–ring meshes in series with the ISO 6336-1 mesh stiffness [1], and </w:t>
+        <w:t xml:space="preserve"> produced by the sun–planet and planet–ring meshes, which act in parallel on the planet [15], with the ISO 6336-1 mesh stiffness [1], and </w:t>
       </w:r>
       <w:r>
         <w:rPr>
@@ -5602,7 +5913,7 @@
         <w:t xml:space="preserve">ref</w:t>
       </w:r>
       <w:r>
-        <w:t xml:space="preserve"> the ratio of the effective path stiffness to the series mesh stiffness. The planetary response is summarised by</w:t>
+        <w:t xml:space="preserve"> the ratio of the effective path stiffness to the mesh-only stiffness. The planetary response is summarised by</w:t>
       </w:r>
     </w:p>
     <w:p>
@@ -5962,7 +6273,217 @@
         <w:t xml:space="preserve">i</w:t>
       </w:r>
       <w:r>
-        <w:t xml:space="preserve">. The proportionality holds only while all planets are loaded and is the planetary counterpart of the first branch of Eq. (4). The design baseline treats </w:t>
+        <w:t xml:space="preserve">; the proportionality holds only while all planets are loaded. For a single tangential error </w:t>
+      </w:r>
+      <w:r>
+        <w:rPr>
+          <w:i/>
+          <w:iCs/>
+        </w:rPr>
+        <w:t xml:space="preserve">e</w:t>
+      </w:r>
+      <w:r>
+        <w:rPr>
+          <w:vertAlign w:val="subscript"/>
+        </w:rPr>
+        <w:t xml:space="preserve">1</w:t>
+      </w:r>
+      <w:r>
+        <w:t xml:space="preserve"> &gt; 0, the closed-form solution of [15] gives the constant explicitly:</w:t>
+      </w:r>
+    </w:p>
+    <w:p>
+      <w:pPr>
+        <w:keepLines/>
+        <w:tabs>
+          <w:tab w:val="center" w:pos="4535"/>
+          <w:tab w:val="right" w:pos="9070"/>
+        </w:tabs>
+        <w:spacing w:before="80" w:after="80"/>
+      </w:pPr>
+      <w:r>
+        <w:tab/>
+      </w:r>
+      <m:oMath>
+        <m:sSub>
+          <m:sSubPr>
+            <m:ctrlPr>
+              <w:rPr>
+                <w:rFonts w:ascii="Cambria Math" w:hAnsi="Cambria Math"/>
+              </w:rPr>
+            </m:ctrlPr>
+          </m:sSubPr>
+          <m:e>
+            <m:r>
+              <w:rPr>
+                <w:rFonts w:ascii="Cambria Math" w:hAnsi="Cambria Math"/>
+              </w:rPr>
+              <m:t xml:space="preserve">K</m:t>
+            </m:r>
+          </m:e>
+          <m:sub>
+            <m:r>
+              <w:rPr>
+                <w:rFonts w:ascii="Cambria Math" w:hAnsi="Cambria Math"/>
+              </w:rPr>
+              <m:t xml:space="preserve">γ</m:t>
+            </m:r>
+          </m:sub>
+        </m:sSub>
+        <m:r>
+          <m:rPr>
+            <m:sty m:val="p"/>
+          </m:rPr>
+          <w:rPr>
+            <w:rFonts w:ascii="Cambria Math" w:hAnsi="Cambria Math"/>
+          </w:rPr>
+          <m:t xml:space="preserve">=1+</m:t>
+        </m:r>
+        <m:sSub>
+          <m:sSubPr>
+            <m:ctrlPr>
+              <w:rPr>
+                <w:rFonts w:ascii="Cambria Math" w:hAnsi="Cambria Math"/>
+              </w:rPr>
+            </m:ctrlPr>
+          </m:sSubPr>
+          <m:e>
+            <m:r>
+              <w:rPr>
+                <w:rFonts w:ascii="Cambria Math" w:hAnsi="Cambria Math"/>
+              </w:rPr>
+              <m:t xml:space="preserve">c</m:t>
+            </m:r>
+          </m:e>
+          <m:sub>
+            <m:r>
+              <w:rPr>
+                <w:rFonts w:ascii="Cambria Math" w:hAnsi="Cambria Math"/>
+              </w:rPr>
+              <m:t xml:space="preserve">n</m:t>
+            </m:r>
+          </m:sub>
+        </m:sSub>
+        <m:sSub>
+          <m:sSubPr>
+            <m:ctrlPr>
+              <w:rPr>
+                <w:rFonts w:ascii="Cambria Math" w:hAnsi="Cambria Math"/>
+              </w:rPr>
+            </m:ctrlPr>
+          </m:sSubPr>
+          <m:e>
+            <m:r>
+              <m:rPr>
+                <m:sty m:val="i"/>
+              </m:rPr>
+              <w:rPr>
+                <w:rFonts w:ascii="Cambria Math" w:hAnsi="Cambria Math"/>
+              </w:rPr>
+              <m:t xml:space="preserve">Π</m:t>
+            </m:r>
+          </m:e>
+          <m:sub>
+            <m:r>
+              <m:rPr>
+                <m:sty m:val="p"/>
+              </m:rPr>
+              <w:rPr>
+                <w:rFonts w:ascii="Cambria Math" w:hAnsi="Cambria Math"/>
+              </w:rPr>
+              <m:t xml:space="preserve">1</m:t>
+            </m:r>
+          </m:sub>
+        </m:sSub>
+      </m:oMath>
+      <w:r>
+        <w:tab/>
+        <w:t>(8)</w:t>
+      </w:r>
+    </w:p>
+    <w:p>
+      <w:pPr>
+        <w:spacing w:before="0" w:after="120" w:line="264" w:lineRule="auto"/>
+        <w:jc w:val="both"/>
+      </w:pPr>
+      <w:r>
+        <w:t xml:space="preserve">where </w:t>
+      </w:r>
+      <w:r>
+        <w:rPr>
+          <w:i/>
+          <w:iCs/>
+        </w:rPr>
+        <w:t xml:space="preserve">Π</w:t>
+      </w:r>
+      <w:r>
+        <w:rPr>
+          <w:vertAlign w:val="subscript"/>
+        </w:rPr>
+        <w:t xml:space="preserve">1</w:t>
+      </w:r>
+      <w:r>
+        <w:t xml:space="preserve"> = </w:t>
+      </w:r>
+      <w:r>
+        <w:rPr>
+          <w:i/>
+          <w:iCs/>
+        </w:rPr>
+        <w:t xml:space="preserve">e</w:t>
+      </w:r>
+      <w:r>
+        <w:rPr>
+          <w:vertAlign w:val="subscript"/>
+        </w:rPr>
+        <w:t xml:space="preserve">1</w:t>
+      </w:r>
+      <w:r>
+        <w:t xml:space="preserve">/</w:t>
+      </w:r>
+      <w:r>
+        <w:rPr>
+          <w:i/>
+          <w:iCs/>
+        </w:rPr>
+        <w:t xml:space="preserve">δ</w:t>
+      </w:r>
+      <w:r>
+        <w:rPr>
+          <w:vertAlign w:val="subscript"/>
+        </w:rPr>
+        <w:t xml:space="preserve">eff</w:t>
+      </w:r>
+      <w:r>
+        <w:t xml:space="preserve"> and </w:t>
+      </w:r>
+      <w:r>
+        <w:rPr>
+          <w:i/>
+          <w:iCs/>
+        </w:rPr>
+        <w:t xml:space="preserve">c</w:t>
+      </w:r>
+      <w:r>
+        <w:rPr>
+          <w:i/>
+          <w:iCs/>
+          <w:vertAlign w:val="subscript"/>
+        </w:rPr>
+        <w:t xml:space="preserve">n</w:t>
+      </w:r>
+      <w:r>
+        <w:t xml:space="preserve"> = 1/4, 2/5 and 1/2 for </w:t>
+      </w:r>
+      <w:r>
+        <w:rPr>
+          <w:i/>
+          <w:iCs/>
+        </w:rPr>
+        <w:t xml:space="preserve">n</w:t>
+      </w:r>
+      <w:r>
+        <w:t xml:space="preserve"> = 4, 5 and 6. For six planets, Eq. (8) has the same form as the first branch of Eq. (4). The design baseline treats </w:t>
       </w:r>
       <w:r>
         <w:rPr>
@@ -5999,7 +6520,7 @@
         <w:jc w:val="both"/>
       </w:pPr>
       <w:r>
-        <w:t xml:space="preserve">Studies were searched for experiments that report a controlled or measured misalignment with a quantitative load-distribution or transmission-error response. A study was used for validation only if the full text was available, the misalignment was quantified and the response could be extracted with a stated uncertainty. Six studies met these criteria for load redistribution [4–6, 23–25]; the companion paper [17] tabulates values for the experiments of [23]. The only transmission-error study found [30] does not report the misalignment magnitude and was used as directional evidence only (Table 2). The qualitative gearbox study [31], numerical studies [7, 8, 10], an encoder study without a misalignment sweep [28] and a trade-journal report [32] of the experiments of [4] were not used for validation. At least three independent sources from at least two laboratories were required before a relation was tested; this was met for load redistribution (rigs at The Ohio State University [4, 5, 23] and an industrial gearbox in Korea [24, 25]) but not for transmission error.</w:t>
+        <w:t xml:space="preserve">Experiments were selected if they reported a controlled or measured misalignment and a quantitative load-distribution or transmission-error response, with the full text available and an extractable uncertainty. Six studies met these criteria for load redistribution [4–6, 23–25], with tabulated values for [23] in [17]; the only transmission-error study [30] lacks the misalignment magnitude and was used as directional evidence (Table 2). The qualitative gearbox study [31], numerical and system-level simulations [7, 8, 10, 21], an encoder study without a misalignment sweep [28] and a trade-journal report [32] of [4] were not used for validation, and the combined load distribution coefficient of [20] was used only qualitatively (Section 5.1). At least three independent sources from at least two laboratories were required before a relation was tested; this was met for load redistribution (The Ohio State University [4, 5, 23]; an industrial gearbox in Korea [24, 25]) but not for transmission error.</w:t>
       </w:r>
     </w:p>
     <w:p>
@@ -6323,7 +6844,7 @@
                 <w:sz w:val="16"/>
                 <w:szCs w:val="16"/>
               </w:rPr>
-              <w:t xml:space="preserve">Helical, 62/62 teeth, normal module 2.04 mm, </w:t>
+              <w:t xml:space="preserve">Helical, 62/62 teeth, normal module 2.04 mm, normal pressure angle 16°, </w:t>
             </w:r>
             <w:r>
               <w:rPr>
@@ -6419,7 +6940,7 @@
                 <w:sz w:val="16"/>
                 <w:szCs w:val="16"/>
               </w:rPr>
-              <w:t xml:space="preserve"> m/m</w:t>
+              <w:t xml:space="preserve"> m/m; gauges 2.7–16.5 mm from one face end</w:t>
             </w:r>
           </w:p>
         </w:tc>
@@ -6517,7 +7038,7 @@
                 <w:sz w:val="16"/>
                 <w:szCs w:val="16"/>
               </w:rPr>
-              <w:t xml:space="preserve">Peak root strain at 5 gauges; ±25 µε (digitised)</w:t>
+              <w:t xml:space="preserve">Peak root strain at 5 gauges; ±25 µε (digitised); calculated mesh deflection 17 µm at 200 N·m</w:t>
             </w:r>
           </w:p>
         </w:tc>
@@ -6914,6 +7435,22 @@
                 <w:sz w:val="16"/>
                 <w:szCs w:val="16"/>
               </w:rPr>
+              <w:t xml:space="preserve">β</w:t>
+            </w:r>
+            <w:r>
+              <w:rPr>
+                <w:sz w:val="16"/>
+                <w:szCs w:val="16"/>
+              </w:rPr>
+              <w:t xml:space="preserve"> = 13.12° [15], </w:t>
+            </w:r>
+            <w:r>
+              <w:rPr>
+                <w:i/>
+                <w:iCs/>
+                <w:sz w:val="16"/>
+                <w:szCs w:val="16"/>
+              </w:rPr>
               <w:t xml:space="preserve">b</w:t>
             </w:r>
             <w:r>
@@ -7427,7 +7964,7 @@
                 <w:sz w:val="16"/>
                 <w:szCs w:val="16"/>
               </w:rPr>
-              <w:t xml:space="preserve">n.r.; static, output fixed; 25–100% of 9119 N·m</w:t>
+              <w:t xml:space="preserve">n.r.; static, output fixed; 25–100% of 9119 N·m (same test analysed in [21])</w:t>
             </w:r>
           </w:p>
         </w:tc>
@@ -8082,7 +8619,7 @@
         <w:jc w:val="both"/>
       </w:pPr>
       <w:r>
-        <w:t xml:space="preserve">Tabulated values were used where available: planetary load percentages [17], load-sharing ratios and mesh load factors [24, 25], and contact areas [6]. Other curves were digitised from the published figures at 200 dpi: axis frames were located by pixel-row and pixel-column detection, and marker centroids were extracted from colour-thresholded profiles at the known gauge or abscissa positions, with overlapping markers resolved manually. The digitisation uncertainty was taken as ±25 µε for helical root strain, ±10 MPa for hypoid root stress and ±0.01 for planet load fraction; the digitised six-planet load fractions at 1000 N·m [23] differed from the tabulated values [17] by at most 0.005.</w:t>
+        <w:t xml:space="preserve">Tabulated values were used where available [6, 17, 24, 25]. Other curves were digitised at 200 dpi by locating the axis frames from pixel rows and columns and extracting colour-thresholded marker centroids at the known gauge or abscissa positions, with overlapping markers resolved manually. The digitisation uncertainty was taken as ±25 µε for helical root strain, ±10 MPa for hypoid root stress and ±0.01 for planet load fraction; the digitised six-planet load fractions at 1000 N·m [23] differed from the tabulated values [17] by at most 0.005.</w:t>
       </w:r>
     </w:p>
     <w:p>
@@ -8265,7 +8802,7 @@
         <w:t xml:space="preserve">γ</w:t>
       </w:r>
       <w:r>
-        <w:t xml:space="preserve"> = 20 N/(mm·µm), a typical value for solid steel spur and helical gears [1].</w:t>
+        <w:t xml:space="preserve"> = 20 N/(mm·µm), a typical value for solid steel spur and helical gears [1]; for planetary sets, they were expressed as the planet-centre displacement produced by the two meshes acting in parallel [15].</w:t>
       </w:r>
     </w:p>
     <w:p>
@@ -8930,50 +9467,7 @@
                 <w:sz w:val="16"/>
                 <w:szCs w:val="16"/>
               </w:rPr>
-              <w:t xml:space="preserve">The helical calibration transfers to a crowned pair through </w:t>
-            </w:r>
-            <w:r>
-              <w:rPr>
-                <w:i/>
-                <w:iCs/>
-                <w:sz w:val="16"/>
-                <w:szCs w:val="16"/>
-              </w:rPr>
-              <w:t xml:space="preserve">C</w:t>
-            </w:r>
-            <w:r>
-              <w:rPr>
-                <w:i/>
-                <w:iCs/>
-                <w:sz w:val="16"/>
-                <w:szCs w:val="16"/>
-                <w:vertAlign w:val="subscript"/>
-              </w:rPr>
-              <w:t xml:space="preserve">β</w:t>
-            </w:r>
-            <w:r>
-              <w:rPr>
-                <w:sz w:val="16"/>
-                <w:szCs w:val="16"/>
-              </w:rPr>
-              <w:t xml:space="preserve">/</w:t>
-            </w:r>
-            <w:r>
-              <w:rPr>
-                <w:i/>
-                <w:iCs/>
-                <w:sz w:val="16"/>
-                <w:szCs w:val="16"/>
-              </w:rPr>
-              <w:t xml:space="preserve">δ</w:t>
-            </w:r>
-            <w:r>
-              <w:rPr>
-                <w:sz w:val="16"/>
-                <w:szCs w:val="16"/>
-                <w:vertAlign w:val="subscript"/>
-              </w:rPr>
-              <w:t xml:space="preserve">m</w:t>
+              <w:t xml:space="preserve">The helical calibration transfers to a crowned pair</w:t>
             </w:r>
           </w:p>
         </w:tc>
@@ -9313,7 +9807,7 @@
                 <w:sz w:val="16"/>
                 <w:szCs w:val="16"/>
               </w:rPr>
-              <w:t xml:space="preserve">A one-parameter compliance model reproduces planet loads as well as a multibody contact model</w:t>
+              <w:t xml:space="preserve">A one-parameter model reproduces planet loads as well as a multibody model</w:t>
             </w:r>
           </w:p>
         </w:tc>
@@ -9343,7 +9837,7 @@
                 <w:sz w:val="16"/>
                 <w:szCs w:val="16"/>
               </w:rPr>
-              <w:t xml:space="preserve">Six-planet load-share RMSE not larger than that of the multibody model [17]</w:t>
+              <w:t xml:space="preserve">Six-planet load-share RMSE not above that of [17]</w:t>
             </w:r>
           </w:p>
         </w:tc>
@@ -9693,7 +10187,7 @@
                 <w:sz w:val="16"/>
                 <w:szCs w:val="16"/>
               </w:rPr>
-              <w:t xml:space="preserve">Per-pin RMSE below equal sharing in both external data sets; peak </w:t>
+              <w:t xml:space="preserve">Per-pin RMSE below equal sharing in both external sets; peak </w:t>
             </w:r>
             <w:r>
               <w:rPr>
@@ -9719,7 +10213,7 @@
                 <w:sz w:val="16"/>
                 <w:szCs w:val="16"/>
               </w:rPr>
-              <w:t xml:space="preserve"> better than constant 1.44</w:t>
+              <w:t xml:space="preserve"> better than 1.44</w:t>
             </w:r>
           </w:p>
         </w:tc>
@@ -9980,7 +10474,7 @@
         <w:t xml:space="preserve">m</w:t>
       </w:r>
       <w:r>
-        <w:t xml:space="preserve"> = 17 µm, the mesh deflection reported for this rig at 200 N·m [4], the regression </w:t>
+        <w:t xml:space="preserve"> = 17 µm, the average mesh deflection along the plane of action calculated in [4] for this pair at 200 N·m from an average mesh stiffness of 169 N/µm, the regression </w:t>
       </w:r>
       <w:r>
         <w:rPr>
@@ -10318,7 +10812,7 @@
         <w:t xml:space="preserve">h</w:t>
       </w:r>
       <w:r>
-        <w:t xml:space="preserve"> &gt; 0 (Fig. 2a), and the distributions cross about 8 mm rather than 10 mm from the reference edge [4]. In the slice model, this corresponds to an effective residual misalignment </w:t>
+        <w:t xml:space="preserve"> &gt; 0 (Fig. 2a), and the distributions cross about 8 mm rather than 10 mm from the reference edge, which [4] attributed to unavoidable shaft misalignment within the test-machine tolerances. In the slice model, this corresponds to an effective residual misalignment </w:t>
       </w:r>
       <w:r>
         <w:rPr>
@@ -10803,7 +11297,7 @@
         <w:t xml:space="preserve">Fβ</w:t>
       </w:r>
       <w:r>
-        <w:t xml:space="preserve"> equals the measured ratio in the most severe case (1.96) and exceeds it by 0.08–0.26 otherwise. Because the outermost gauges lie about 3 mm inside the face ends, the measured ratio is a lower bound for the true factor, so Method C is conservative by a small margin once the residual misalignment is known.</w:t>
+        <w:t xml:space="preserve"> equals the measured ratio in the most severe case (1.96) and exceeds it by 0.08–0.26 otherwise. Because the outermost gauges lie 2.7 and 3.5 mm inside the face ends [4], the measured ratio is a lower bound for the true factor, so Method C is conservative by a small margin once the residual misalignment is known.</w:t>
       </w:r>
     </w:p>
     <w:p>
@@ -12215,37 +12709,7 @@
         <w:t xml:space="preserve">V</w:t>
       </w:r>
       <w:r>
-        <w:t xml:space="preserve"> = 0.35 reflects the inherent toe–heel asymmetry of the hypoid contact. H3 is therefore supported within ±0.2 mm at 300 N·m. The </w:t>
-      </w:r>
-      <w:r>
-        <w:rPr>
-          <w:i/>
-          <w:iCs/>
-        </w:rPr>
-        <w:t xml:space="preserve">H</w:t>
-      </w:r>
-      <w:r>
-        <w:t xml:space="preserve"> error mainly changed the stress level along the face, the </w:t>
-      </w:r>
-      <w:r>
-        <w:rPr>
-          <w:i/>
-          <w:iCs/>
-        </w:rPr>
-        <w:t xml:space="preserve">G</w:t>
-      </w:r>
-      <w:r>
-        <w:t xml:space="preserve"> error combined a level change with a shift towards the heel, and the </w:t>
-      </w:r>
-      <w:r>
-        <w:rPr>
-          <w:i/>
-          <w:iCs/>
-        </w:rPr>
-        <w:t xml:space="preserve">γ</w:t>
-      </w:r>
-      <w:r>
-        <w:t xml:space="preserve"> error produced trends too small to resolve [5].</w:t>
+        <w:t xml:space="preserve"> = 0.35 reflects the inherent toe–heel asymmetry of the hypoid contact. H3 is therefore supported within ±0.2 mm at 300 N·m.</w:t>
       </w:r>
     </w:p>
     <w:p>
@@ -12498,7 +12962,7 @@
         <w:jc w:val="both"/>
       </w:pPr>
       <w:r>
-        <w:t xml:space="preserve">The ISO deflection of the two meshes of this rig at 1000 N·m is </w:t>
+        <w:t xml:space="preserve">At 1000 N·m, the two meshes acting in parallel displace the planet centre by </w:t>
       </w:r>
       <w:r>
         <w:rPr>
@@ -12514,7 +12978,7 @@
         <w:t xml:space="preserve">ISO</w:t>
       </w:r>
       <w:r>
-        <w:t xml:space="preserve"> = 9.8 µm, so </w:t>
+        <w:t xml:space="preserve"> = 4.9 µm with the ISO stiffness (tangential mesh force 2.46 kN per planet), so </w:t>
       </w:r>
       <w:r>
         <w:rPr>
@@ -12524,7 +12988,7 @@
         <w:t xml:space="preserve">η</w:t>
       </w:r>
       <w:r>
-        <w:t xml:space="preserve"> = 0.23: the effective path is about 4.3 times more compliant than the meshes alone. The planet needle bearing (radial stiffness 2.5 × </w:t>
+        <w:t xml:space="preserve"> = 0.12: the effective path is about 8.6 times more compliant than the meshes alone. The planet needle bearing (2.0–2.5 × </w:t>
       </w:r>
       <w:r>
         <w:t xml:space="preserve">10</w:t>
@@ -12536,7 +13000,19 @@
         <w:t xml:space="preserve">5</w:t>
       </w:r>
       <w:r>
-        <w:t xml:space="preserve"> N/mm [17]) accounts for part of the difference, and the ring rim and its spline support probably for the rest. Fitting </w:t>
+        <w:t xml:space="preserve"> N/mm [15, 17]) adds about 20–25 µm under its 4.9 kN load; the remainder is attributed to the ring rim, its spline support and a mesh stiffness below the generic value. The calibrated deflection is consistent with the planet support stiffness of 9 × </w:t>
+      </w:r>
+      <w:r>
+        <w:t xml:space="preserve">10</w:t>
+      </w:r>
+      <w:r>
+        <w:rPr>
+          <w:vertAlign w:val="superscript"/>
+        </w:rPr>
+        <w:t xml:space="preserve">4</w:t>
+      </w:r>
+      <w:r>
+        <w:t xml:space="preserve"> N/mm identified for this rig with a deformable-body model [15], which gives about 55 µm. Fitting </w:t>
       </w:r>
       <w:r>
         <w:rPr>
@@ -13162,7 +13638,7 @@
         <w:t xml:space="preserve">η</w:t>
       </w:r>
       <w:r>
-        <w:t xml:space="preserve"> = 0.23 and </w:t>
+        <w:t xml:space="preserve"> = 0.12 and </w:t>
       </w:r>
       <w:r>
         <w:rPr>
@@ -13182,7 +13658,7 @@
         <w:t xml:space="preserve">b</w:t>
       </w:r>
       <w:r>
-        <w:t xml:space="preserve"> = 72 mm, ring pitch radius 196 mm). Because the sign convention of the errors relative to the direction of rotation is ambiguous in [25], both mappings were evaluated. With the floating-sun model and the better mapping, the per-pin RMSE for [25] was 0.321 against 0.424 for equal sharing, a 24% reduction (Fig. 5a); the opposite mapping gave 0.586, and a fixed-sun model 0.82–0.90. For [24], the model gave 0.407 against 0.391 for equal sharing (Fig. 5b): the pinhole errors did not explain the measured pattern. The peak factor was predicted with an RMSE of 0.408 [25] and 0.461 [24], worse than 0.358 and 0.238 for the constant 1.44, so H6 is not supported.</w:t>
+        <w:t xml:space="preserve"> = 72 mm, ring pitch radius 196 mm). Because the sign convention of the errors relative to the direction of rotation is ambiguous in [25], both mappings were evaluated. With the floating-sun model and the better mapping, the per-pin RMSE for [25] was 0.321 against 0.424 for equal sharing, a 24% reduction (Fig. 5a); the opposite mapping gave 0.586, and a fixed-sun model 0.82–0.90. For [24], the model gave 0.407 against 0.391 for equal sharing (Fig. 5b): the transferred model did not explain the measured pattern. The peak factor was predicted with an RMSE of 0.408 [25] and 0.461 [24], worse than 0.358 and 0.238 for the constant 1.44, so H6 is not supported.</w:t>
       </w:r>
     </w:p>
     <w:p>
@@ -13321,7 +13797,7 @@
           <w:sz w:val="20"/>
           <w:szCs w:val="20"/>
         </w:rPr>
-        <w:t xml:space="preserve"> = 0.23 and </w:t>
+        <w:t xml:space="preserve"> = 0.12 and </w:t>
       </w:r>
       <w:r>
         <w:rPr>
@@ -13362,7 +13838,7 @@
         <w:t xml:space="preserve">ref</w:t>
       </w:r>
       <w:r>
-        <w:t xml:space="preserve"> was fitted to the 100% torque data of each external set, and the other torque levels were predicted. For [25], the per-pin RMSE was 0.341 against 0.456 for equal sharing on the same subset, and the peak-factor RMSE was 0.391 with </w:t>
+        <w:t xml:space="preserve"> was fitted to the 100% torque data of each external set and the other torque levels were predicted. For [25], the per-pin RMSE was 0.341 against 0.456 for equal sharing on the same subset, and the peak-factor RMSE was 0.391 with </w:t>
       </w:r>
       <w:r>
         <w:rPr>
@@ -13382,17 +13858,51 @@
         <w:t xml:space="preserve">m</w:t>
       </w:r>
       <w:r>
-        <w:t xml:space="preserve"> = 1, against 0.393 for the constant; the better result for </w:t>
-      </w:r>
-      <w:r>
-        <w:rPr>
-          <w:i/>
-          <w:iCs/>
-        </w:rPr>
-        <w:t xml:space="preserve">m</w:t>
-      </w:r>
-      <w:r>
-        <w:t xml:space="preserve"> = 1 agrees with the CW exponent of 1.16 (Fig. 4b). For [24], the recalibrated deflection reached the upper bound of the search range (2000 µm), i.e. the fit reverted to equal sharing. Load sharing on this gearbox is therefore influenced by factors not captured by the reported pinhole errors, such as pin manufacturing errors, strain-gauge calibration [24] and the static, output-fixed test condition.</w:t>
+        <w:t xml:space="preserve"> = 1, against 0.393 for the constant, in line with the CW exponent of 1.16 (Fig. 4b). For [24], the fit reverted to equal sharing (</w:t>
+      </w:r>
+      <w:r>
+        <w:rPr>
+          <w:i/>
+          <w:iCs/>
+        </w:rPr>
+        <w:t xml:space="preserve">δ</w:t>
+      </w:r>
+      <w:r>
+        <w:rPr>
+          <w:vertAlign w:val="subscript"/>
+        </w:rPr>
+        <w:t xml:space="preserve">ref</w:t>
+      </w:r>
+      <w:r>
+        <w:t xml:space="preserve"> at the upper search bound of 2000 µm). Yet for the 100% condition of the same test, the load shares computed with a system-level model [21] give an RMSE of </w:t>
+      </w:r>
+      <w:r>
+        <w:rPr>
+          <w:i/>
+          <w:iCs/>
+        </w:rPr>
+        <w:t xml:space="preserve">nL</w:t>
+      </w:r>
+      <w:r>
+        <w:rPr>
+          <w:i/>
+          <w:iCs/>
+          <w:vertAlign w:val="subscript"/>
+        </w:rPr>
+        <w:t xml:space="preserve">i</w:t>
+      </w:r>
+      <w:r>
+        <w:t xml:space="preserve"> of 0.07 against 0.23 for equal sharing, so the measured errors carry information that the single-spring model with transferred </w:t>
+      </w:r>
+      <w:r>
+        <w:rPr>
+          <w:i/>
+          <w:iCs/>
+        </w:rPr>
+        <w:t xml:space="preserve">η</w:t>
+      </w:r>
+      <w:r>
+        <w:t xml:space="preserve"> does not capture.</w:t>
       </w:r>
     </w:p>
     <w:p>
@@ -15515,7 +16025,7 @@
         <w:jc w:val="both"/>
       </w:pPr>
       <w:r>
-        <w:t xml:space="preserve">In the unloaded contact-pattern experiments of [6], the elastic deflection is negligible, </w:t>
+        <w:t xml:space="preserve">In the unloaded contact-pattern experiments of [6], the elastic deflection is negligible and </w:t>
       </w:r>
       <w:r>
         <w:rPr>
@@ -15525,7 +16035,7 @@
         <w:t xml:space="preserve">Π</w:t>
       </w:r>
       <w:r>
-        <w:t xml:space="preserve"> is effectively infinite and the contact extent is set by geometry. The contact area fell by 28.4% for a 6 mm axial offset and by 17.7% and 32.3% for centre-distance increases of 1 and 2 mm, close to the geometric model of the same authors (Table 6). For angular misalignments of 2.64° and 4.67° (23 and 41 times the largest slope in [4]), it fell by 14.0% and 37.5%, about 6 percentage points less than the geometric model predicts. These data confirm the geometric limit but carry no information on the elastic redistribution described by </w:t>
+        <w:t xml:space="preserve"> is effectively infinite. The measured contact-area reductions for axial and radial offsets agreed with the geometric model of the same authors within 1.6 percentage points, and those for angular misalignments of 2.64° and 4.67° (23 and 41 times the largest slope in [4]) were about 6 percentage points smaller (Table 6). These data confirm the geometric limit but carry no information on the elastic redistribution described by </w:t>
       </w:r>
       <w:r>
         <w:rPr>
@@ -16528,7 +17038,7 @@
         <w:jc w:val="both"/>
       </w:pPr>
       <w:r>
-        <w:t xml:space="preserve">Table 7 summarises the parameter uncertainties and sensitivities. The helical result depends on the reported mesh deflection of 17 µm: a 20% error changes </w:t>
+        <w:t xml:space="preserve">Table 7 summarises the parameter uncertainties and sensitivities. The helical result depends on the mesh deflection of 17 µm calculated in [4]: a 20% error changes </w:t>
       </w:r>
       <w:r>
         <w:rPr>
@@ -16538,7 +17048,7 @@
         <w:t xml:space="preserve">κ</w:t>
       </w:r>
       <w:r>
-        <w:t xml:space="preserve"> by the same fraction and moves its CI to 0.64–0.84 or 0.96–1.26. The ISO 6336-1 mean mesh stiffness gives </w:t>
+        <w:t xml:space="preserve"> by the same fraction and moves its CI to 0.64–0.84 or 0.96–1.26. The generic ISO 6336-1 mesh stiffness would give </w:t>
       </w:r>
       <w:r>
         <w:rPr>
@@ -16554,33 +17064,7 @@
         <w:t xml:space="preserve">m</w:t>
       </w:r>
       <w:r>
-        <w:t xml:space="preserve"> ≈ 6.7 µm for this pair at 200 N·m (</w:t>
-      </w:r>
-      <w:r>
-        <w:rPr>
-          <w:i/>
-          <w:iCs/>
-        </w:rPr>
-        <w:t xml:space="preserve">F</w:t>
-      </w:r>
-      <w:r>
-        <w:rPr>
-          <w:vertAlign w:val="subscript"/>
-        </w:rPr>
-        <w:t xml:space="preserve">t</w:t>
-      </w:r>
-      <w:r>
-        <w:t xml:space="preserve">/</w:t>
-      </w:r>
-      <w:r>
-        <w:rPr>
-          <w:i/>
-          <w:iCs/>
-        </w:rPr>
-        <w:t xml:space="preserve">b</w:t>
-      </w:r>
-      <w:r>
-        <w:t xml:space="preserve"> ≈ 133 N/mm at a reference diameter of 150 mm), for which </w:t>
+        <w:t xml:space="preserve"> ≈ 6.7 µm for this pair at 200 N·m (133 N/mm of tangential load at the reference diameter of 150 mm) and </w:t>
       </w:r>
       <w:r>
         <w:rPr>
@@ -16590,17 +17074,17 @@
         <w:t xml:space="preserve">κ</w:t>
       </w:r>
       <w:r>
-        <w:t xml:space="preserve"> would be about 0.36. The reported rig deflection is thus about 2.5 times the ISO mesh deflection, the same trend as </w:t>
-      </w:r>
-      <w:r>
-        <w:rPr>
-          <w:i/>
-          <w:iCs/>
-        </w:rPr>
-        <w:t xml:space="preserve">η</w:t>
-      </w:r>
-      <w:r>
-        <w:t xml:space="preserve"> = 0.23 in the planetary set, although the contributions of shafts, bearings and gear bodies could not be separated. The exponent </w:t>
+        <w:t xml:space="preserve"> ≈ 0.36. The stiffness calculated in [4] for this narrow, high-helix-angle pair, 169 N/µm or about 8.5 N/(mm·µm), is less than half the generic value, so </w:t>
+      </w:r>
+      <w:r>
+        <w:rPr>
+          <w:i/>
+          <w:iCs/>
+        </w:rPr>
+        <w:t xml:space="preserve">Π</w:t>
+      </w:r>
+      <w:r>
+        <w:t xml:space="preserve"> must be formed with a pair-specific mesh stiffness. The exponent </w:t>
       </w:r>
       <w:r>
         <w:rPr>
@@ -17038,7 +17522,7 @@
                 <w:sz w:val="16"/>
                 <w:szCs w:val="16"/>
               </w:rPr>
-              <w:t xml:space="preserve">17 µm (reported)</w:t>
+              <w:t xml:space="preserve">17 µm (calculated in [4])</w:t>
             </w:r>
           </w:p>
         </w:tc>
@@ -17084,7 +17568,7 @@
                 <w:sz w:val="16"/>
                 <w:szCs w:val="16"/>
               </w:rPr>
-              <w:t xml:space="preserve"> 0.64–0.84 or 0.96–1.26; ISO value 6.7 µm: </w:t>
+              <w:t xml:space="preserve"> 0.64–0.84 or 0.96–1.26; generic ISO stiffness (6.7 µm): </w:t>
             </w:r>
             <w:r>
               <w:rPr>
@@ -17127,10 +17611,19 @@
             </w:pPr>
             <w:r>
               <w:rPr>
-                <w:sz w:val="16"/>
-                <w:szCs w:val="16"/>
-              </w:rPr>
-              <w:t xml:space="preserve">Agreement with slice theory requires the measured rig deflection</w:t>
+                <w:i/>
+                <w:iCs/>
+                <w:sz w:val="16"/>
+                <w:szCs w:val="16"/>
+              </w:rPr>
+              <w:t xml:space="preserve">Π</w:t>
+            </w:r>
+            <w:r>
+              <w:rPr>
+                <w:sz w:val="16"/>
+                <w:szCs w:val="16"/>
+              </w:rPr>
+              <w:t xml:space="preserve"> must be formed with a pair-specific mesh stiffness</w:t>
             </w:r>
           </w:p>
         </w:tc>
@@ -17662,7 +18155,154 @@
                 <w:sz w:val="16"/>
                 <w:szCs w:val="16"/>
               </w:rPr>
-              <w:t xml:space="preserve"> = 0.22–0.25</w:t>
+              <w:t xml:space="preserve"> = 0.11–0.12</w:t>
+            </w:r>
+          </w:p>
+        </w:tc>
+      </w:tr>
+      <w:tr>
+        <w:trPr>
+          <w:cantSplit/>
+        </w:trPr>
+        <w:tc>
+          <w:tcPr>
+            <w:tcW w:w="2000" w:type="dxa"/>
+            <w:tcBorders>
+              <w:top w:val="nil"/>
+              <w:left w:val="nil"/>
+              <w:bottom w:val="nil"/>
+              <w:right w:val="nil"/>
+            </w:tcBorders>
+            <w:tcMar>
+              <w:top w:w="30" w:type="dxa"/>
+              <w:left w:w="60" w:type="dxa"/>
+              <w:bottom w:w="30" w:type="dxa"/>
+              <w:right w:w="60" w:type="dxa"/>
+            </w:tcMar>
+          </w:tcPr>
+          <w:p>
+            <w:pPr>
+              <w:spacing w:before="0" w:after="0" w:line="240" w:lineRule="auto"/>
+              <w:jc w:val="left"/>
+            </w:pPr>
+            <w:r>
+              <w:rPr>
+                <w:sz w:val="16"/>
+                <w:szCs w:val="16"/>
+              </w:rPr>
+              <w:t xml:space="preserve">Planet support stiffness of the rig [15]</w:t>
+            </w:r>
+          </w:p>
+        </w:tc>
+        <w:tc>
+          <w:tcPr>
+            <w:tcW w:w="1500" w:type="dxa"/>
+            <w:tcBorders>
+              <w:top w:val="nil"/>
+              <w:left w:val="nil"/>
+              <w:bottom w:val="nil"/>
+              <w:right w:val="nil"/>
+            </w:tcBorders>
+            <w:tcMar>
+              <w:top w:w="30" w:type="dxa"/>
+              <w:left w:w="60" w:type="dxa"/>
+              <w:bottom w:w="30" w:type="dxa"/>
+              <w:right w:w="60" w:type="dxa"/>
+            </w:tcMar>
+          </w:tcPr>
+          <w:p>
+            <w:pPr>
+              <w:spacing w:before="0" w:after="0" w:line="240" w:lineRule="auto"/>
+              <w:jc w:val="left"/>
+            </w:pPr>
+            <w:r>
+              <w:rPr>
+                <w:sz w:val="16"/>
+                <w:szCs w:val="16"/>
+              </w:rPr>
+              <w:t xml:space="preserve">9 × </w:t>
+            </w:r>
+            <w:r>
+              <w:rPr>
+                <w:sz w:val="16"/>
+                <w:szCs w:val="16"/>
+              </w:rPr>
+              <w:t xml:space="preserve">10</w:t>
+            </w:r>
+            <w:r>
+              <w:rPr>
+                <w:sz w:val="16"/>
+                <w:szCs w:val="16"/>
+                <w:vertAlign w:val="superscript"/>
+              </w:rPr>
+              <w:t xml:space="preserve">4</w:t>
+            </w:r>
+            <w:r>
+              <w:rPr>
+                <w:sz w:val="16"/>
+                <w:szCs w:val="16"/>
+              </w:rPr>
+              <w:t xml:space="preserve"> N/mm</w:t>
+            </w:r>
+          </w:p>
+        </w:tc>
+        <w:tc>
+          <w:tcPr>
+            <w:tcW w:w="3000" w:type="dxa"/>
+            <w:tcBorders>
+              <w:top w:val="nil"/>
+              <w:left w:val="nil"/>
+              <w:bottom w:val="nil"/>
+              <w:right w:val="nil"/>
+            </w:tcBorders>
+            <w:tcMar>
+              <w:top w:w="30" w:type="dxa"/>
+              <w:left w:w="60" w:type="dxa"/>
+              <w:bottom w:w="30" w:type="dxa"/>
+              <w:right w:w="60" w:type="dxa"/>
+            </w:tcMar>
+          </w:tcPr>
+          <w:p>
+            <w:pPr>
+              <w:spacing w:before="0" w:after="0" w:line="240" w:lineRule="auto"/>
+              <w:jc w:val="left"/>
+            </w:pPr>
+            <w:r>
+              <w:rPr>
+                <w:sz w:val="16"/>
+                <w:szCs w:val="16"/>
+              </w:rPr>
+              <w:t xml:space="preserve">Planet-centre deflection about 55 µm at 1000 N·m, six planets</w:t>
+            </w:r>
+          </w:p>
+        </w:tc>
+        <w:tc>
+          <w:tcPr>
+            <w:tcW w:w="2570" w:type="dxa"/>
+            <w:tcBorders>
+              <w:top w:val="nil"/>
+              <w:left w:val="nil"/>
+              <w:bottom w:val="nil"/>
+              <w:right w:val="nil"/>
+            </w:tcBorders>
+            <w:tcMar>
+              <w:top w:w="30" w:type="dxa"/>
+              <w:left w:w="60" w:type="dxa"/>
+              <w:bottom w:w="30" w:type="dxa"/>
+              <w:right w:w="60" w:type="dxa"/>
+            </w:tcMar>
+          </w:tcPr>
+          <w:p>
+            <w:pPr>
+              <w:spacing w:before="0" w:after="0" w:line="240" w:lineRule="auto"/>
+              <w:jc w:val="left"/>
+            </w:pPr>
+            <w:r>
+              <w:rPr>
+                <w:sz w:val="16"/>
+                <w:szCs w:val="16"/>
+              </w:rPr>
+              <w:t xml:space="preserve">Same order as the calibrated 42 µm</w:t>
             </w:r>
           </w:p>
         </w:tc>
@@ -18209,7 +18849,17 @@
         <w:jc w:val="both"/>
       </w:pPr>
       <w:r>
-        <w:t xml:space="preserve">The results support a restricted form of the hypothesis: within one rig and while every load path remains in contact, redistribution depends on misalignment through the ratio of geometric mismatch to elastic path deflection, both across the face width and among the planets. The two settings differ in the load path over which the deflection is measured: the planetary path, including planet bearing, pin and ring rim, was about four times more compliant than the meshes alone, and the helical rig deflection was about 2.5 times the ISO mesh deflection. The deflection that controls redistribution thus exceeds the mesh deflection used in standard rating, consistent with models in which support and component compliance enter the load distribution [18, 19].</w:t>
+        <w:t xml:space="preserve">The results support a restricted form of the hypothesis: within one rig and while every load path remains in contact, redistribution depends on misalignment through the ratio of geometric mismatch to elastic deflection, both across the face width and among the planets. The settings differ in the deflection that enters the ratio. In the helical pair, it was the mesh deflection itself, provided that it was calculated for the specific pair; the generic ISO stiffness would have overstated </w:t>
+      </w:r>
+      <w:r>
+        <w:rPr>
+          <w:i/>
+          <w:iCs/>
+        </w:rPr>
+        <w:t xml:space="preserve">Π</w:t>
+      </w:r>
+      <w:r>
+        <w:t xml:space="preserve"> by a factor of 2.5. In the planetary set, the planet-centre deflection was about 8.6 times the mesh-only value, about half of it from the planet bearing, and was consistent with the planet support stiffness identified independently for the same rig [15]. Support and component compliance therefore control planet-to-planet redistribution, as in models that include them [18, 19]. For six planets, the planetary relation, Eq. (8), and the linear branch of Method C, Eq. (4), have the same form.</w:t>
       </w:r>
     </w:p>
     <w:p>
@@ -18227,6 +18877,25 @@
         <w:jc w:val="both"/>
       </w:pPr>
       <w:r>
+        <w:t xml:space="preserve">In planetary sets, the two modes coexist: planet tilting loads opposite face ends of the sun–planet and ring–planet meshes [19], and in a 2 MW wind-turbine stage with measured three-dimensional pinhole errors, the measured coefficient combining both distributions fell from about 2.0–2.25 at 25% to 1.45–1.6 at 100% of the rated torque for three and four planets [20]. Since a three-planet set with a floating member shares load equally regardless of tangential pinhole errors [15], this decrease must include face-width redistribution, which therefore also relaxes with load, as </w:t>
+      </w:r>
+      <w:r>
+        <w:rPr>
+          <w:i/>
+          <w:iCs/>
+        </w:rPr>
+        <w:t xml:space="preserve">Π</w:t>
+      </w:r>
+      <w:r>
+        <w:t xml:space="preserve"> implies.</w:t>
+      </w:r>
+    </w:p>
+    <w:p>
+      <w:pPr>
+        <w:spacing w:before="0" w:after="120" w:line="264" w:lineRule="auto"/>
+        <w:jc w:val="both"/>
+      </w:pPr>
+      <w:r>
         <w:t xml:space="preserve">Two findings bear on design practice. First, </w:t>
       </w:r>
       <w:r>
@@ -18245,7 +18914,23 @@
         <w:t xml:space="preserve">γ</w:t>
       </w:r>
       <w:r>
-        <w:t xml:space="preserve"> was not constant. A decrease with torque is implicit in linear discrete models, including the closed-form formulation of [15], and visible in the measurements used here [23–25]; the present analysis quantifies it across two laboratories, with exponents below 1 in fourteen of fifteen series (pooled 0.73). This is expected if a fixed geometric error is resisted by a path that stiffens with load. A constant factor such as 1.44 cannot represent this dependence: on the industrial gearbox, the measured peak factor ranged from 1.21 to 2.30 for the same hardware. Second, the path deflection was not proportional to load (</w:t>
+        <w:t xml:space="preserve"> was not constant. In linear discrete models, the deviation of each planet load from its nominal share is proportional to the pinhole errors and inversely proportional to </w:t>
+      </w:r>
+      <w:r>
+        <w:rPr>
+          <w:i/>
+          <w:iCs/>
+        </w:rPr>
+        <w:t xml:space="preserve">T</w:t>
+      </w:r>
+      <w:r>
+        <w:rPr>
+          <w:vertAlign w:val="subscript"/>
+        </w:rPr>
+        <w:t xml:space="preserve">s</w:t>
+      </w:r>
+      <w:r>
+        <w:t xml:space="preserve"> [15], i.e. </w:t>
       </w:r>
       <w:r>
         <w:rPr>
@@ -18255,7 +18940,17 @@
         <w:t xml:space="preserve">m</w:t>
       </w:r>
       <w:r>
-        <w:t xml:space="preserve"> ≈ 0.5–0.8). Hertzian contact of crowned or edge-loaded teeth, take-up of bearing clearance and support stiffening all produce this response, and the present data do not separate them. In both settings, the linear relation fails once one face end or one planet is unloaded: the face load factor then grows with the square root of </w:t>
+        <w:t xml:space="preserve"> = 1 in Eq. (6); the measurements used here [23–25] instead gave exponents below 1 in fourteen of fifteen series from two laboratories (pooled 0.73). A constant factor such as 1.44 cannot represent this dependence: on the industrial gearbox, the measured peak factor ranged from 1.21 to 2.30 for the same hardware. Second, the path deflection was not proportional to load (</w:t>
+      </w:r>
+      <w:r>
+        <w:rPr>
+          <w:i/>
+          <w:iCs/>
+        </w:rPr>
+        <w:t xml:space="preserve">m</w:t>
+      </w:r>
+      <w:r>
+        <w:t xml:space="preserve"> ≈ 0.5–0.8), as expected if the path stiffens with load. Possible sources are the nonlinearity of the effective planet stiffness noted in [15], the load-dependent mesh stiffness of modified teeth [19], Hertzian contact and the take-up of bearing clearance; the present data do not separate them. In both settings, the linear relation fails once one face end or one planet is unloaded: the face load factor then grows with the square root of </w:t>
       </w:r>
       <w:r>
         <w:rPr>
@@ -18283,7 +18978,7 @@
         <w:t xml:space="preserve">γ</w:t>
       </w:r>
       <w:r>
-        <w:t xml:space="preserve"> saturates.</w:t>
+        <w:t xml:space="preserve"> saturates; system-level simulations of the industrial gearbox show the same saturation [21].</w:t>
       </w:r>
     </w:p>
     <w:p>
@@ -18311,7 +19006,7 @@
         <w:jc w:val="both"/>
       </w:pPr>
       <w:r>
-        <w:t xml:space="preserve">The partial success of the external validation (Section 4.5) shows that the pinhole error alone is an incomplete description of an industrial carrier, and that </w:t>
+        <w:t xml:space="preserve">For the external data set in which the transferred model failed (Section 4.5), a system-level model with carrier, pin, bearing and housing flexibilities reproduced the 100% torque load shares within 10% from the same errors [21]. The pinhole errors therefore explain the load pattern, but one spring per planet with </w:t>
       </w:r>
       <w:r>
         <w:rPr>
@@ -18321,7 +19016,17 @@
         <w:t xml:space="preserve">η</w:t>
       </w:r>
       <w:r>
-        <w:t xml:space="preserve"> has to be measured or computed for each design, for example with three-dimensional or multi-mesh load distribution models [18–20]. A single coefficient that transfers across architectures is not supported by the present evidence.</w:t>
+        <w:t xml:space="preserve"> transferred from a laboratory rig does not represent an industrial carrier, whose pinhole errors also differ between the front and rear plates by up to 33 µm [21], a three-dimensional error that affects load distribution [20]. </w:t>
+      </w:r>
+      <w:r>
+        <w:rPr>
+          <w:i/>
+          <w:iCs/>
+        </w:rPr>
+        <w:t xml:space="preserve">η</w:t>
+      </w:r>
+      <w:r>
+        <w:t xml:space="preserve"> must be determined for each design, for example with system-level or three-dimensional models [18–21]; a coefficient that transfers across architectures is not supported.</w:t>
       </w:r>
     </w:p>
     <w:p>
@@ -18385,7 +19090,7 @@
         <w:t xml:space="preserve">h</w:t>
       </w:r>
       <w:r>
-        <w:t xml:space="preserve"> = 0. The planetary model represents each path by one spring and ignores sun-support stiffness, carrier deformation, planet tilting and dynamic effects; the industrial data were measured at rest and at 85.9 </w:t>
+        <w:t xml:space="preserve"> = 0. The planetary model represents each path by one spring and ignores sun-support stiffness, carrier deformation, planet tilting [19], three-dimensional pinhole errors [20] and dynamic effects; the industrial data were measured at rest and at 85.9 </w:t>
       </w:r>
       <w:r>
         <w:t xml:space="preserve">min</w:t>
@@ -18446,7 +19151,27 @@
         <w:t xml:space="preserve">Π</w:t>
       </w:r>
       <w:r>
-        <w:t xml:space="preserve"> with a coefficient of 0.90 (95% CI 0.80–1.05). This agreement with slice theory holds for the measured rig deflection, which was about 2.5 times the ISO mesh deflection. With an effective residual misalignment of −0.4 × </w:t>
+        <w:t xml:space="preserve"> with a coefficient of 0.90 (95% CI 0.80–1.05) when </w:t>
+      </w:r>
+      <w:r>
+        <w:rPr>
+          <w:i/>
+          <w:iCs/>
+        </w:rPr>
+        <w:t xml:space="preserve">Π</w:t>
+      </w:r>
+      <w:r>
+        <w:t xml:space="preserve"> was formed with the mesh deflection calculated for the specific pair; the generic ISO 6336-1 mesh stiffness would overstate </w:t>
+      </w:r>
+      <w:r>
+        <w:rPr>
+          <w:i/>
+          <w:iCs/>
+        </w:rPr>
+        <w:t xml:space="preserve">Π</w:t>
+      </w:r>
+      <w:r>
+        <w:t xml:space="preserve"> by a factor of about 2.5. With an effective residual misalignment of −0.4 × </w:t>
       </w:r>
       <w:r>
         <w:t xml:space="preserve">10</w:t>
@@ -18468,7 +19193,7 @@
         <w:jc w:val="both"/>
       </w:pPr>
       <w:r>
-        <w:t xml:space="preserve">(2) For planetary sets with a floating sun, a one-parameter path model based on the same ratio reproduced measured six-planet load shares within 1.6 percentage points, comparable to a multibody contact model.</w:t>
+        <w:t xml:space="preserve">(2) For planetary sets with a floating sun, a one-parameter path model based on the same ratio reproduced measured six-planet load shares within 1.6 percentage points, comparable to a multibody contact model. For a single pinhole error and six planets, it has the same form as the linear branch of Method C.</w:t>
       </w:r>
     </w:p>
     <w:p>
@@ -18478,7 +19203,7 @@
         <w:jc w:val="both"/>
       </w:pPr>
       <w:r>
-        <w:t xml:space="preserve">(3) The effective planetary path deflection was about 4.3 times the ISO mesh deflection and grew sub-linearly with load. Consequently, </w:t>
+        <w:t xml:space="preserve">(3) The effective planet-centre deflection was about 8.6 times the mesh-only value from ISO 6336-1, about half of it from the planet bearing, and grew sub-linearly with load. Consequently, </w:t>
       </w:r>
       <w:r>
         <w:rPr>
@@ -18526,7 +19251,7 @@
         <w:jc w:val="both"/>
       </w:pPr>
       <w:r>
-        <w:t xml:space="preserve">(5) The laboratory calibration did not transfer to an industrial six-planet gearbox in absolute terms, and the published experiments do not allow a misalignment–transmission-error relation to be tested.</w:t>
+        <w:t xml:space="preserve">(5) The laboratory calibration did not transfer to an industrial six-planet gearbox in absolute terms, because one spring per planet does not represent the system compliance of an industrial carrier, and the published experiments do not allow a misalignment–transmission-error relation to be tested.</w:t>
       </w:r>
     </w:p>
     <w:p>
@@ -19122,7 +19847,7 @@
           <w:sz w:val="20"/>
           <w:szCs w:val="20"/>
         </w:rPr>
-        <w:t xml:space="preserve">(2), 021007.</w:t>
+        <w:t xml:space="preserve">(2), 021007. https://doi.org/10.1115/1.3042160</w:t>
       </w:r>
     </w:p>
     <w:p>

</xml_diff>

<commit_message>
Apply full scientific and editorial audit to revised manuscript
Corrected kappa with the generic ISO stiffness (0.35), the exponent
interpretation in Section 4.4, the description of the two industrial data
sets as gearboxes of one type, undefined table symbols, and the JSME journal
title; removed a repeated statement; made figure units (N·m) and symbol
styles (italic Pi, upright descriptive subscripts) consistent with the text.

Co-Authored-By: Claude Opus 5.5 <noreply@anthropic.com>
Claude-Session: https://claude.ai/code/session_012H2iBimd6WnZpPhhsFnRvZ
</commit_message>
<xml_diff>
--- a/Misalignment_Load_Redistribution_IJPEM_revised.docx
+++ b/Misalignment_Load_Redistribution_IJPEM_revised.docx
@@ -92,7 +92,7 @@
         <w:t xml:space="preserve">2</w:t>
       </w:r>
       <w:r>
-        <w:t xml:space="preserve"> = 0.975) when the pair-specific mesh deflection was used, and ISO 6336-1 Method C matched or exceeded the measured root-strain ratios once an effective residual misalignment was included. For planetary sets with a floating sun, a one-parameter path model based on the same ratio reproduced measured six-planet load shares with a root-mean-square error of 1.6 percentage points, as accurately as a multibody contact model. The effective planet-centre deflection was about 8.6 times the mesh-only value from ISO 6336-1 and grew sub-linearly with load, so the mesh load factor decreased with torque with a pooled exponent of 0.73 (95% confidence interval 0.64–0.83). Without recalibration, the model reduced the per-pin error on an industrial six-planet gearbox by 24% in one of two data sets. No published transmission-error study reports both misalignment magnitude and mesh deflection, so a transmission-error relation could not be tested.</w:t>
+        <w:t xml:space="preserve"> = 0.975) when the pair-specific mesh deflection was used, and ISO 6336-1 Method C matched or exceeded the measured root-strain ratios once an effective residual misalignment was included. For planetary sets with a floating sun, a one-parameter path model based on the same ratio reproduced measured six-planet load shares with a root-mean-square error of 1.6 percentage points, as accurately as a multibody contact model. The effective planet-centre deflection was about 8.6 times the mesh-only value from ISO 6336-1 and grew sub-linearly with load, so the mesh load factor decreased with torque with a pooled exponent of 0.73 (95% confidence interval 0.64–0.83). Without recalibration, the model reduced the per-pin error on industrial six-planet gearboxes by 24% in one of two data sets. No published transmission-error study reports both misalignment magnitude and mesh deflection, so a transmission-error relation could not be tested.</w:t>
       </w:r>
     </w:p>
     <w:p>
@@ -285,7 +285,17 @@
         <w:t xml:space="preserve">γ</w:t>
       </w:r>
       <w:r>
-        <w:t xml:space="preserve"> decreases sub-linearly with torque; and (3) a statement of the current limits, namely the incomplete transfer to an industrial gearbox and the absence of experiments that would allow a misalignment–transmission-error relation to be tested.</w:t>
+        <w:t xml:space="preserve"> − 1 decreases with torque more slowly than 1/</w:t>
+      </w:r>
+      <w:r>
+        <w:rPr>
+          <w:i/>
+          <w:iCs/>
+        </w:rPr>
+        <w:t xml:space="preserve">T</w:t>
+      </w:r>
+      <w:r>
+        <w:t xml:space="preserve">; and (3) a statement of the current limits, namely the incomplete transfer to an industrial gearbox and the absence of experiments that would allow a misalignment–transmission-error relation to be tested.</w:t>
       </w:r>
     </w:p>
     <w:p>
@@ -333,7 +343,7 @@
         <w:jc w:val="both"/>
       </w:pPr>
       <w:r>
-        <w:t xml:space="preserve">Planet load sharing has been modelled with discrete [13–15], system-level and deformable-body [16, 17] and three-dimensional formulations that include manufacturing errors and tooth modifications [18–20]. The translational analogy of [15] represents each planet by its sun and ring mesh springs in parallel, in series with the planet bearing, and gives closed-form planet loads while all planets remain loaded. Multi-mesh models show that planet tilting loads opposite face ends of the sun–planet and ring–planet meshes [19], and slice-based models with three-dimensional pinhole errors were validated on wind-turbine stages [20]. A system-level model of an industrial gearbox reproduced its measured load shares within 10% [21], and the system configuration has been studied parametrically [22]. Experimentally, a single carrier pinhole error can almost unload a planet [17, 23], and measurements on the same industrial gearbox quantified the effect of measured pinhole errors under static and rotating conditions [24, 25]. No single governing ratio has been identified, and the torque dependence of </w:t>
+        <w:t xml:space="preserve">Planet load sharing has been modelled with discrete [13–15], system-level and deformable-body [16, 17] and three-dimensional formulations that include manufacturing errors and tooth modifications [18–20]. The translational analogy of [15] represents each planet by its sun and ring mesh springs in parallel, in series with the planet bearing, and gives closed-form planet loads while all planets remain loaded. Multi-mesh models show that planet tilting loads opposite face ends of the sun–planet and ring–planet meshes [19], and slice-based models with three-dimensional pinhole errors were validated on wind-turbine stages [20]. A system-level model of an industrial gearbox reproduced its measured load shares within 10% [21], and the system configuration has been studied parametrically [22]. Experimentally, a single carrier pinhole error can almost unload a planet [17, 23], and measurements on industrial gearboxes of this type with measured carriers quantified the effect of pinhole errors under static and rotating conditions [24, 25]. No single governing ratio has been identified, and the torque dependence of </w:t>
       </w:r>
       <w:r>
         <w:rPr>
@@ -6520,7 +6530,7 @@
         <w:jc w:val="both"/>
       </w:pPr>
       <w:r>
-        <w:t xml:space="preserve">Experiments were selected if they reported a controlled or measured misalignment and a quantitative load-distribution or transmission-error response, with the full text available and an extractable uncertainty. Six studies met these criteria for load redistribution [4–6, 23–25], with tabulated values for [23] in [17]; the only transmission-error study [30] lacks the misalignment magnitude and was used as directional evidence (Table 2). The qualitative gearbox study [31], numerical and system-level simulations [7, 8, 10, 21], an encoder study without a misalignment sweep [28] and a trade-journal report [32] of [4] were not used for validation, and the combined load distribution coefficient of [20] was used only qualitatively (Section 5.1). At least three independent sources from at least two laboratories were required before a relation was tested; this was met for load redistribution (The Ohio State University [4, 5, 23]; an industrial gearbox in Korea [24, 25]) but not for transmission error.</w:t>
+        <w:t xml:space="preserve">Experiments were selected if they reported a controlled or measured misalignment and a quantitative load-distribution or transmission-error response, with the full text available and an extractable uncertainty. Six studies met these criteria for load redistribution [4–6, 23–25], with tabulated values for [23] in [17]; the only transmission-error study [30] lacks the misalignment magnitude and was used as directional evidence (Table 2). The qualitative gearbox study [31], numerical and system-level simulations [7, 8, 10, 21], an encoder study without a misalignment sweep [28] and a trade-journal report [32] of [4] were not used for validation, and the combined load distribution coefficient of [20] was used only qualitatively (Section 5.1). At least three independent sources from at least two laboratories were required before a relation was tested; this was met for load redistribution (The Ohio State University [4, 5, 23]; industrial gearboxes of one type in Korea [24, 25]) but not for transmission error.</w:t>
       </w:r>
     </w:p>
     <w:p>
@@ -6844,7 +6854,7 @@
                 <w:sz w:val="16"/>
                 <w:szCs w:val="16"/>
               </w:rPr>
-              <w:t xml:space="preserve">Helical, 62/62 teeth, normal module 2.04 mm, normal pressure angle 16°, </w:t>
+              <w:t xml:space="preserve">Helical, 62/62 teeth, normal module 2.04 mm, normal pressure angle 16°, helix angle 32.5°, </w:t>
             </w:r>
             <w:r>
               <w:rPr>
@@ -6853,14 +6863,14 @@
                 <w:sz w:val="16"/>
                 <w:szCs w:val="16"/>
               </w:rPr>
-              <w:t xml:space="preserve">β</w:t>
-            </w:r>
-            <w:r>
-              <w:rPr>
-                <w:sz w:val="16"/>
-                <w:szCs w:val="16"/>
-              </w:rPr>
-              <w:t xml:space="preserve"> = 32.5°, </w:t>
+              <w:t xml:space="preserve">b</w:t>
+            </w:r>
+            <w:r>
+              <w:rPr>
+                <w:sz w:val="16"/>
+                <w:szCs w:val="16"/>
+              </w:rPr>
+              <w:t xml:space="preserve"> = 20 mm; </w:t>
             </w:r>
             <w:r>
               <w:rPr>
@@ -6869,14 +6879,7 @@
                 <w:sz w:val="16"/>
                 <w:szCs w:val="16"/>
               </w:rPr>
-              <w:t xml:space="preserve">b</w:t>
-            </w:r>
-            <w:r>
-              <w:rPr>
-                <w:sz w:val="16"/>
-                <w:szCs w:val="16"/>
-              </w:rPr>
-              <w:t xml:space="preserve"> = 20 mm; </w:t>
+              <w:t xml:space="preserve">C</w:t>
             </w:r>
             <w:r>
               <w:rPr>
@@ -6884,8 +6887,16 @@
                 <w:iCs/>
                 <w:sz w:val="16"/>
                 <w:szCs w:val="16"/>
-              </w:rPr>
-              <w:t xml:space="preserve">C</w:t>
+                <w:vertAlign w:val="subscript"/>
+              </w:rPr>
+              <w:t xml:space="preserve">β</w:t>
+            </w:r>
+            <w:r>
+              <w:rPr>
+                <w:sz w:val="16"/>
+                <w:szCs w:val="16"/>
+              </w:rPr>
+              <w:t xml:space="preserve"> = 0, 12, 25 µm; </w:t>
             </w:r>
             <w:r>
               <w:rPr>
@@ -6893,23 +6904,6 @@
                 <w:iCs/>
                 <w:sz w:val="16"/>
                 <w:szCs w:val="16"/>
-                <w:vertAlign w:val="subscript"/>
-              </w:rPr>
-              <w:t xml:space="preserve">β</w:t>
-            </w:r>
-            <w:r>
-              <w:rPr>
-                <w:sz w:val="16"/>
-                <w:szCs w:val="16"/>
-              </w:rPr>
-              <w:t xml:space="preserve"> = 0, 12, 25 µm; </w:t>
-            </w:r>
-            <w:r>
-              <w:rPr>
-                <w:i/>
-                <w:iCs/>
-                <w:sz w:val="16"/>
-                <w:szCs w:val="16"/>
               </w:rPr>
               <w:t xml:space="preserve">h</w:t>
             </w:r>
@@ -6970,23 +6964,7 @@
                 <w:sz w:val="16"/>
                 <w:szCs w:val="16"/>
               </w:rPr>
-              <w:t xml:space="preserve">Steel, </w:t>
-            </w:r>
-            <w:r>
-              <w:rPr>
-                <w:i/>
-                <w:iCs/>
-                <w:sz w:val="16"/>
-                <w:szCs w:val="16"/>
-              </w:rPr>
-              <w:t xml:space="preserve">E</w:t>
-            </w:r>
-            <w:r>
-              <w:rPr>
-                <w:sz w:val="16"/>
-                <w:szCs w:val="16"/>
-              </w:rPr>
-              <w:t xml:space="preserve"> = 207 GPa; 200 </w:t>
+              <w:t xml:space="preserve">Steel, elastic modulus 207 GPa; 200 </w:t>
             </w:r>
             <w:r>
               <w:rPr>
@@ -7426,23 +7404,7 @@
                 <w:sz w:val="16"/>
                 <w:szCs w:val="16"/>
               </w:rPr>
-              <w:t xml:space="preserve">Helical planetary, 73/26/125 teeth (sun/planet/ring), normal module 1.81 mm, </w:t>
-            </w:r>
-            <w:r>
-              <w:rPr>
-                <w:i/>
-                <w:iCs/>
-                <w:sz w:val="16"/>
-                <w:szCs w:val="16"/>
-              </w:rPr>
-              <w:t xml:space="preserve">β</w:t>
-            </w:r>
-            <w:r>
-              <w:rPr>
-                <w:sz w:val="16"/>
-                <w:szCs w:val="16"/>
-              </w:rPr>
-              <w:t xml:space="preserve"> = 13.12° [15], </w:t>
+              <w:t xml:space="preserve">Helical planetary, 73/26/125 teeth (sun/planet/ring), normal module 1.81 mm, helix angle 13.12° [15], </w:t>
             </w:r>
             <w:r>
               <w:rPr>
@@ -8716,7 +8678,7 @@
         <w:t xml:space="preserve">i</w:t>
       </w:r>
       <w:r>
-        <w:t xml:space="preserve"> for the industrial gearbox), whose maximum is </w:t>
+        <w:t xml:space="preserve"> for the industrial gearboxes), whose maximum is </w:t>
       </w:r>
       <w:r>
         <w:rPr>
@@ -13000,7 +12962,7 @@
         <w:t xml:space="preserve">5</w:t>
       </w:r>
       <w:r>
-        <w:t xml:space="preserve"> N/mm [15, 17]) adds about 20–25 µm under its 4.9 kN load; the remainder is attributed to the ring rim, its spline support and a mesh stiffness below the generic value. The calibrated deflection is consistent with the planet support stiffness of 9 × </w:t>
+        <w:t xml:space="preserve"> N/mm [15, 17]) adds about 20–25 µm under its 4.9 kN load; the remainder probably comes from the ring rim, its spline support and a mesh stiffness below the generic value. The calibrated deflection is consistent with the planet support stiffness of 9 × </w:t>
       </w:r>
       <w:r>
         <w:t xml:space="preserve">10</w:t>
@@ -13285,7 +13247,7 @@
         <w:t xml:space="preserve">m</w:t>
       </w:r>
       <w:r>
-        <w:t xml:space="preserve"> = 1). The four industrial series alone also average 0.73, so the pooled value is not driven by one laboratory; its excess over the </w:t>
+        <w:t xml:space="preserve"> = 1). The four industrial series alone also average 0.73, so the pooled value is not driven by one laboratory. The pooled value lies slightly above the bootstrap range (0.2–0.7) of the </w:t>
       </w:r>
       <w:r>
         <w:rPr>
@@ -13295,7 +13257,7 @@
         <w:t xml:space="preserve">m</w:t>
       </w:r>
       <w:r>
-        <w:t xml:space="preserve"> = 0.5 of the six-planet calibration set indicates a rig-dependent exponent of about 0.5–0.8. The exponent also differs from 0, the value implied by a torque-independent design factor: all fifteen exponents were positive (sign test, </w:t>
+        <w:t xml:space="preserve"> fitted to the six-planet calibration set, which three torque levels constrain poorly (Section 4.7); taken together, the data indicate an exponent between about 0.5 and 0.8. The exponent also differs from 0, the value implied by a torque-independent design factor: all fifteen exponents were positive (sign test, </w:t>
       </w:r>
       <w:r>
         <w:rPr>
@@ -13619,7 +13581,7 @@
         <w:spacing w:before="180" w:after="80"/>
       </w:pPr>
       <w:r>
-        <w:t xml:space="preserve">4.5 External Validation on an Industrial Gearbox</w:t>
+        <w:t xml:space="preserve">4.5 External Validation on Industrial Gearboxes</w:t>
       </w:r>
     </w:p>
     <w:p>
@@ -13628,7 +13590,7 @@
         <w:jc w:val="both"/>
       </w:pPr>
       <w:r>
-        <w:t xml:space="preserve">The industrial gearbox [24, 25] was predicted from its measured pinhole errors with </w:t>
+        <w:t xml:space="preserve">The industrial gearboxes [24, 25] were predicted from their measured pinhole errors with </w:t>
       </w:r>
       <w:r>
         <w:rPr>
@@ -13737,7 +13699,7 @@
           <w:sz w:val="20"/>
           <w:szCs w:val="20"/>
         </w:rPr>
-        <w:t xml:space="preserve">External validation on the industrial six-planet gearbox. Per-pin mesh load factors </w:t>
+        <w:t xml:space="preserve">External validation on industrial six-planet gearboxes. Per-pin mesh load factors </w:t>
       </w:r>
       <w:r>
         <w:rPr>
@@ -17074,7 +17036,7 @@
         <w:t xml:space="preserve">κ</w:t>
       </w:r>
       <w:r>
-        <w:t xml:space="preserve"> ≈ 0.36. The stiffness calculated in [4] for this narrow, high-helix-angle pair, 169 N/µm or about 8.5 N/(mm·µm), is less than half the generic value, so </w:t>
+        <w:t xml:space="preserve"> ≈ 0.35. The stiffness calculated in [4] for this narrow, high-helix-angle pair, 169 N/µm or about 8.5 N/(mm·µm), is less than half the generic value, so </w:t>
       </w:r>
       <w:r>
         <w:rPr>
@@ -17584,7 +17546,7 @@
                 <w:sz w:val="16"/>
                 <w:szCs w:val="16"/>
               </w:rPr>
-              <w:t xml:space="preserve"> ≈ 0.36</w:t>
+              <w:t xml:space="preserve"> ≈ 0.35</w:t>
             </w:r>
           </w:p>
         </w:tc>
@@ -18859,7 +18821,7 @@
         <w:t xml:space="preserve">Π</w:t>
       </w:r>
       <w:r>
-        <w:t xml:space="preserve"> by a factor of 2.5. In the planetary set, the planet-centre deflection was about 8.6 times the mesh-only value, about half of it from the planet bearing, and was consistent with the planet support stiffness identified independently for the same rig [15]. Support and component compliance therefore control planet-to-planet redistribution, as in models that include them [18, 19]. For six planets, the planetary relation, Eq. (8), and the linear branch of Method C, Eq. (4), have the same form.</w:t>
+        <w:t xml:space="preserve"> by a factor of 2.5. In the planetary set, the planet-centre deflection was about 8.6 times the mesh-only value, about half of it from the planet bearing, and was consistent with the planet support stiffness identified independently for the same rig [15]. Support and component compliance therefore dominate the deflection that governs planet-to-planet redistribution, as in models that include them [18, 19].</w:t>
       </w:r>
     </w:p>
     <w:p>
@@ -18940,7 +18902,7 @@
         <w:t xml:space="preserve">m</w:t>
       </w:r>
       <w:r>
-        <w:t xml:space="preserve"> = 1 in Eq. (6); the measurements used here [23–25] instead gave exponents below 1 in fourteen of fifteen series from two laboratories (pooled 0.73). A constant factor such as 1.44 cannot represent this dependence: on the industrial gearbox, the measured peak factor ranged from 1.21 to 2.30 for the same hardware. Second, the path deflection was not proportional to load (</w:t>
+        <w:t xml:space="preserve"> = 1 in Eq. (6); the measurements used here [23–25] instead gave exponents below 1 in fourteen of fifteen series from two laboratories (pooled 0.73). A constant factor such as 1.44 cannot represent this dependence: in the industrial data of [25], the measured peak factor ranged from 1.21 to 2.30 for the same hardware. Second, the path deflection was not proportional to load (</w:t>
       </w:r>
       <w:r>
         <w:rPr>
@@ -18978,7 +18940,7 @@
         <w:t xml:space="preserve">γ</w:t>
       </w:r>
       <w:r>
-        <w:t xml:space="preserve"> saturates; system-level simulations of the industrial gearbox show the same saturation [21].</w:t>
+        <w:t xml:space="preserve"> saturates; system-level simulations of the gearbox of [24] show the same saturation [21].</w:t>
       </w:r>
     </w:p>
     <w:p>
@@ -18997,7 +18959,7 @@
         <w:spacing w:before="180" w:after="80"/>
       </w:pPr>
       <w:r>
-        <w:t xml:space="preserve">5.2 Transfer to an Industrial Gearbox</w:t>
+        <w:t xml:space="preserve">5.2 Transfer to Industrial Gearboxes</w:t>
       </w:r>
     </w:p>
     <w:p>
@@ -19251,7 +19213,7 @@
         <w:jc w:val="both"/>
       </w:pPr>
       <w:r>
-        <w:t xml:space="preserve">(5) The laboratory calibration did not transfer to an industrial six-planet gearbox in absolute terms, because one spring per planet does not represent the system compliance of an industrial carrier, and the published experiments do not allow a misalignment–transmission-error relation to be tested.</w:t>
+        <w:t xml:space="preserve">(5) The laboratory calibration did not transfer to industrial six-planet gearboxes in absolute terms, because one spring per planet does not represent the system compliance of an industrial carrier, and the published experiments do not allow a misalignment–transmission-error relation to be tested.</w:t>
       </w:r>
     </w:p>
     <w:p>
@@ -19806,7 +19768,7 @@
           <w:sz w:val="20"/>
           <w:szCs w:val="20"/>
         </w:rPr>
-        <w:t xml:space="preserve">JSME International Journal Series C, 47</w:t>
+        <w:t xml:space="preserve">JSME International Journal Series C Mechanical Systems, Machine Elements and Manufacturing, 47</w:t>
       </w:r>
       <w:r>
         <w:rPr>

</xml_diff>